<commit_message>
Sync main manuscript docx to author-filled version.
</commit_message>
<xml_diff>
--- a/paper/Water_MaskView_Dianchi_manuscript.docx
+++ b/paper/Water_MaskView_Dianchi_manuscript.docx
@@ -28,7 +28,7 @@
           <w:i w:val="0"/>
           <w:sz w:val="22"/>
         </w:rPr>
-        <w:t>[Author Name 1] 1,*, [Author Name 2] 1 and [Author Name 3] 2</w:t>
+        <w:t>Senjie Zhang 1,*</w:t>
       </w:r>
     </w:p>
     <w:p>
@@ -43,7 +43,7 @@
           <w:i/>
           <w:sz w:val="20"/>
         </w:rPr>
-        <w:t>1 [Department / School], [University], [City] [Postcode], [Country]; 2 [Affiliation 2]</w:t>
+        <w:t>(张森捷)</w:t>
       </w:r>
     </w:p>
     <w:p>
@@ -58,7 +58,22 @@
           <w:i/>
           <w:sz w:val="20"/>
         </w:rPr>
-        <w:t>*Correspondence: author@institution.edu</w:t>
+        <w:t>1 Lanzhou University, Lanzhou 730000, Gansu, China</w:t>
+      </w:r>
+    </w:p>
+    <w:p>
+      <w:pPr>
+        <w:spacing w:after="120" w:line="276" w:lineRule="auto"/>
+        <w:jc w:val="center"/>
+      </w:pPr>
+      <w:r>
+        <w:rPr>
+          <w:rFonts w:ascii="Times New Roman" w:hAnsi="Times New Roman" w:eastAsia="Times New Roman"/>
+          <w:b w:val="0"/>
+          <w:i/>
+          <w:sz w:val="20"/>
+        </w:rPr>
+        <w:t>*Correspondence: 3079099853@qq.com</w:t>
       </w:r>
     </w:p>
     <w:p>
@@ -88,7 +103,7 @@
           <w:i/>
           <w:sz w:val="18"/>
         </w:rPr>
-        <w:t>Journal: Water (MDPI)  ·  Article Type: Article  ·  Section: Water Quality  ·  Manuscript status: FINAL CONTENT (fill authors before SuSy upload)</w:t>
+        <w:t>Journal: Water (MDPI)  ·  Article Type: Article  ·  Section: Water Quality  ·  Special Issue (optional): Water Quality Studies—Nutrients and Pollutants, 2nd Edition</w:t>
       </w:r>
     </w:p>
     <w:p>
@@ -103,7 +118,7 @@
           <w:color w:val="666666"/>
           <w:sz w:val="18"/>
         </w:rPr>
-        <w:t>Submission note: Paste this document into the official MDPI Water Microsoft Word template (https://www.mdpi.com/journal/water/instructions). Replace bracketed author/funding fields. All numerical results below are locked to the released benchmark tables (105 model–settings + ablations).</w:t>
+        <w:t>Submission note: Paste this document into the official MDPI Water Microsoft Word template (https://www.mdpi.com/journal/water/instructions) before SuSy upload. All numerical results below are locked to the released benchmark tables (105 model–settings + ablations). ORCID may be added in SuSy if available.</w:t>
       </w:r>
     </w:p>
     <w:p>
@@ -7823,7 +7838,7 @@
           <w:i w:val="0"/>
           <w:sz w:val="22"/>
         </w:rPr>
-        <w:t>Conceptualization, X.X. and Y.Y.; methodology, X.X.; software, X.X.; validation, X.X.; formal analysis, X.X.; data curation, X.X.; writing—original draft preparation, X.X.; writing—review and editing, Y.Y.; visualization, X.X.; supervision, Y.Y.; project administration, Y.Y. All authors have read and agreed to the published version of the manuscript. (Replace X.X./Y.Y. with real initials before submission.)</w:t>
+        <w:t>Conceptualization, S.Z.; methodology, S.Z.; software, S.Z.; validation, S.Z.; formal analysis, S.Z.; data curation, S.Z.; writing—original draft preparation, S.Z.; writing—review and editing, S.Z.; visualization, S.Z.; project administration, S.Z. The author has read and agreed to the published version of the manuscript.</w:t>
       </w:r>
     </w:p>
     <w:p>
@@ -7852,7 +7867,7 @@
           <w:i w:val="0"/>
           <w:sz w:val="22"/>
         </w:rPr>
-        <w:t>This research received no external funding. / Alternatively: This research was funded by [FUNDER], grant number [###].</w:t>
+        <w:t>This research received no external funding.</w:t>
       </w:r>
     </w:p>
     <w:p>
@@ -7968,7 +7983,7 @@
           <w:i w:val="0"/>
           <w:sz w:val="22"/>
         </w:rPr>
-        <w:t>The authors thank the compilers of the open Dianchi monitoring dataset and the China National Environmental Monitoring Center (CNEMC) automatic monitoring data release system.</w:t>
+        <w:t>The author thanks the compilers of the open Dianchi monitoring dataset and the China National Environmental Monitoring Center (CNEMC) automatic monitoring data release system.</w:t>
       </w:r>
     </w:p>
     <w:p>
@@ -7997,7 +8012,7 @@
           <w:i w:val="0"/>
           <w:sz w:val="22"/>
         </w:rPr>
-        <w:t>The authors declare no conflicts of interest.</w:t>
+        <w:t>The author declares no conflicts of interest.</w:t>
       </w:r>
     </w:p>
     <w:p>
@@ -8055,7 +8070,7 @@
           <w:i w:val="0"/>
           <w:sz w:val="20"/>
         </w:rPr>
-        <w:t>1. Liu, W.; et al. Eutrophication of Lake Dianchi and its watershed: A review of nutrient sources and management. J. Environ. Sci. 2019. (expand with definitive Dianchi review before proof).</w:t>
+        <w:t>1. Liu, Y.; Wang, Y.; Sheng, H.; Dong, F.; Zou, R.; Zhao, L.; Guo, H.; Zhu, X.; He, B. Quantitative evaluation of lake eutrophication responses under alternative water diversion scenarios: A water quality modeling based statistical analysis approach. Sci. Total Environ. 2014, 468–469, 219–227.</w:t>
       </w:r>
     </w:p>
     <w:p>
@@ -8070,7 +8085,7 @@
           <w:i w:val="0"/>
           <w:sz w:val="20"/>
         </w:rPr>
-        <w:t>2. Wang, S.; et al. Water quality trends and ecological status of plateau lakes in Yunnan, China. Ecol. Indic. 2021.</w:t>
+        <w:t>2. Huang, C.; Wang, X.; Yang, H.; Li, Y.; Wang, Y.; Chen, X.; Xu, L. Satellite data regarding the eutrophication response to human activities in the plateau lake Dianchi in China from 1974 to 2009. Sci. Total Environ. 2014, 485–486, 1–11.</w:t>
       </w:r>
     </w:p>
     <w:p>
@@ -8115,7 +8130,7 @@
           <w:i w:val="0"/>
           <w:sz w:val="20"/>
         </w:rPr>
-        <w:t>5. Ahmed, A.N.; et al. Machine learning methods for better water quality prediction. J. Hydrol. 2019, 578, 124084.</w:t>
+        <w:t>5. Ahmed, A.N.; Othman, F.B.; Afan, H.A.; Ibrahim, R.K.; Fai, C.M.; Hossain, M.S.; Ehteram, M.; Elshafie, A. Machine learning methods for better water quality prediction. J. Hydrol. 2019, 578, 124084.</w:t>
       </w:r>
     </w:p>
     <w:p>
@@ -8175,7 +8190,7 @@
           <w:i w:val="0"/>
           <w:sz w:val="20"/>
         </w:rPr>
-        <w:t>9. Cao, W.; Wang, D.; Li, J.; Zhou, H.; Li, L.; Li, Y. BRITS: Bidirectional Recurrent Imputation for Time Series. In Advances in Neural Information Processing Systems; 2018.</w:t>
+        <w:t>9. Cao, W.; Wang, D.; Li, J.; Zhou, H.; Li, L.; Li, Y. BRITS: Bidirectional Recurrent Imputation for Time Series. In Advances in Neural Information Processing Systems; Curran Associates: Red Hook, NY, USA, 2018.</w:t>
       </w:r>
     </w:p>
     <w:p>
@@ -8220,7 +8235,7 @@
           <w:i w:val="0"/>
           <w:sz w:val="20"/>
         </w:rPr>
-        <w:t>12. Cini, A.; Marisca, I.; Alippi, C. Filling the GApS: Multivariate Time Series Imputation by Graph Neural Networks. In International Conference on Learning Representations; 2022.</w:t>
+        <w:t>12. Cini, A.; Marisca, I.; Alippi, C. Filling the GApS: Multivariate Time Series Imputation by Graph Neural Networks. In Proceedings of the International Conference on Learning Representations (ICLR), 2022.</w:t>
       </w:r>
     </w:p>
     <w:p>
@@ -8235,7 +8250,7 @@
           <w:i w:val="0"/>
           <w:sz w:val="20"/>
         </w:rPr>
-        <w:t>13. Wu, Z.; Pan, S.; Long, G.; Jiang, J.; Zhang, C. Graph WaveNet for Deep Spatial-Temporal Graph Modeling. In International Joint Conference on Artificial Intelligence; 2019.</w:t>
+        <w:t>13. Wu, Z.; Pan, S.; Long, G.; Jiang, J.; Zhang, C. Graph WaveNet for Deep Spatial-Temporal Graph Modeling. In Proceedings of the 28th International Joint Conference on Artificial Intelligence (IJCAI), Macao, China, 2019; pp. 1907–1913.</w:t>
       </w:r>
     </w:p>
     <w:p>
@@ -8280,7 +8295,7 @@
           <w:i w:val="0"/>
           <w:sz w:val="20"/>
         </w:rPr>
-        <w:t>16. Abu-El-Haija, S.; et al. MixHop: Higher-Order Graph Convolutional Architectures via Sparsified Neighborhood Mixing. In International Conference on Machine Learning; 2019.</w:t>
+        <w:t>16. Abu-El-Haija, S.; Perozzi, B.; Kapoor, A.; Alipourfard, N.; Lerman, K.; Harutyunyan, H.; Ver Steeg, G.; Galstyan, A. MixHop: Higher-Order Graph Convolutional Architectures via Sparsified Neighborhood Mixing. In Proceedings of the 36th International Conference on Machine Learning (ICML), Long Beach, CA, USA, 2019.</w:t>
       </w:r>
     </w:p>
     <w:p>
@@ -8355,7 +8370,7 @@
           <w:i w:val="0"/>
           <w:sz w:val="20"/>
         </w:rPr>
-        <w:t>21. Yi, X.; Zheng, Y.; Zhang, J.; Li, T. ST-MVL: Filling Missing Values in Geo-Sensory Time Series Data. In International Joint Conference on Artificial Intelligence; 2016.</w:t>
+        <w:t>21. Yi, X.; Zheng, Y.; Zhang, J.; Li, T. ST-MVL: Filling Missing Values in Geo-Sensory Time Series Data. In Proceedings of the 25th International Joint Conference on Artificial Intelligence (IJCAI), New York, NY, USA, 2016; pp. 2704–2710.</w:t>
       </w:r>
     </w:p>
     <w:p>
@@ -8370,7 +8385,7 @@
           <w:i w:val="0"/>
           <w:sz w:val="20"/>
         </w:rPr>
-        <w:t>22. Shi, X.; et al. Convolutional LSTM Network: A Machine Learning Approach for Precipitation Nowcasting. In Advances in Neural Information Processing Systems; 2015.</w:t>
+        <w:t>22. Cao, D.; Wang, Y.; Duan, J.; Zhang, C.; Zhu, X.; Huang, C.; Tong, Y.; Xu, B.; Bai, J.; Tong, J.; Zhang, Q. Spectral Temporal Graph Neural Network for Multivariate Time-series Forecasting. In Advances in Neural Information Processing Systems; 2020. (StemGNN; used as GRIN* proxy).</w:t>
       </w:r>
     </w:p>
     <w:p>
@@ -8385,7 +8400,7 @@
           <w:i w:val="0"/>
           <w:sz w:val="20"/>
         </w:rPr>
-        <w:t>23. Vaswani, A.; et al. Attention Is All You Need. In Advances in Neural Information Processing Systems; 2017.</w:t>
+        <w:t>23. Vaswani, A.; Shazeer, N.; Parmar, N.; Uszkoreit, J.; Jones, L.; Gomez, A.N.; Kaiser, Ł.; Polosukhin, I. Attention Is All You Need. In Advances in Neural Information Processing Systems; 2017.</w:t>
       </w:r>
     </w:p>
     <w:p>
@@ -8400,7 +8415,7 @@
           <w:i w:val="0"/>
           <w:sz w:val="20"/>
         </w:rPr>
-        <w:t>24. Kipf, T.N.; Welling, M. Semi-Supervised Classification with Graph Convolutional Networks. In International Conference on Learning Representations; 2017.</w:t>
+        <w:t>24. Kipf, T.N.; Welling, M. Semi-Supervised Classification with Graph Convolutional Networks. In Proceedings of the International Conference on Learning Representations (ICLR), 2017.</w:t>
       </w:r>
     </w:p>
     <w:p>
@@ -8415,7 +8430,7 @@
           <w:i w:val="0"/>
           <w:sz w:val="20"/>
         </w:rPr>
-        <w:t>25. Veličković, P.; et al. Graph Attention Networks. In International Conference on Learning Representations; 2018.</w:t>
+        <w:t>25. Veličković, P.; Cucurull, G.; Casanova, A.; Romero, A.; Liò, P.; Bengio, Y. Graph Attention Networks. In Proceedings of the International Conference on Learning Representations (ICLR), 2018.</w:t>
       </w:r>
     </w:p>
     <w:p>
@@ -8445,7 +8460,7 @@
           <w:i w:val="0"/>
           <w:sz w:val="20"/>
         </w:rPr>
-        <w:t>27. Ministry of Ecology and Environment of the People’s Republic of China. Environmental Quality Standards for Surface Water (GB 3838-2002). Beijing, China, 2002.</w:t>
+        <w:t>27. Ministry of Ecology and Environment of the People’s Republic of China. Environmental Quality Standards for Surface Water (GB 3838-2002); Beijing, China, 2002.</w:t>
       </w:r>
     </w:p>
     <w:p>
@@ -8460,7 +8475,7 @@
           <w:i w:val="0"/>
           <w:sz w:val="20"/>
         </w:rPr>
-        <w:t>28. Ke, G.; et al. LightGBM: A Highly Efficient Gradient Boosting Decision Tree. In Advances in Neural Information Processing Systems; 2017.</w:t>
+        <w:t>28. Ke, G.; Meng, Q.; Finley, T.; Wang, T.; Chen, W.; Ma, W.; Ye, Q.; Liu, T.-Y. LightGBM: A Highly Efficient Gradient Boosting Decision Tree. In Advances in Neural Information Processing Systems; 2017.</w:t>
       </w:r>
     </w:p>
     <w:p>
@@ -8475,7 +8490,7 @@
           <w:i w:val="0"/>
           <w:sz w:val="20"/>
         </w:rPr>
-        <w:t>29. Hylleberg, S. Seasonality in regression models with applications to environmental series. (use definitive DO/hypoxia monitoring papers for your lab before proof).</w:t>
+        <w:t>29. Gao, W.; Howarth, R.W.; Swaney, D.P.; Hong, B.; Guo, H.C. Enhanced N input to Lake Dianchi Basin from human activities: Implications for management. Environ. Pollut. 2015, 198, 234–242.</w:t>
       </w:r>
     </w:p>
     <w:p>
@@ -8490,7 +8505,7 @@
           <w:i w:val="0"/>
           <w:sz w:val="20"/>
         </w:rPr>
-        <w:t>30. Please replace any ‘et al.’ placeholders for Dianchi/eutrophication reviews with definitive bibliographic records from Web of Science / Scopus before proof stage.</w:t>
+        <w:t>30. Zhang, Y.; Ma, R.; Zhang, M.; Duan, H.; Loiselle, S.; Xu, J. Fourteen-year record (2000–2013) of the spatial and temporal dynamics of floating algae blooms in Lake Dianchi, China. Remote Sens. 2015, 7, 11203–11222.</w:t>
       </w:r>
     </w:p>
     <w:sectPr>

</xml_diff>